<commit_message>
S6 deck fixes from John's slide review: road slide shrink-to-fit (83), sample restoration blessing on the demo slide (87), pairs order made pair-true across 88-89 + notes (parents first, Companion residue removed), 'walk my brothers and sisters home' (90); changelog v2.11; S3 storytelling sibling flagged
Co-Authored-By: Claude Fable 5 <noreply@anthropic.com>
</commit_message>
<xml_diff>
--- a/_implementation-notes/evening-series/FotH Evening Session 6 Leader Notes DRAFT v1.docx
+++ b/_implementation-notes/evening-series/FotH Evening Session 6 Leader Notes DRAFT v1.docx
@@ -703,7 +703,7 @@
         <w:ind w:left="216"/>
       </w:pPr>
       <w:r>
-        <w:t>1. The Companion opens with ninety seconds of silence, then goes first (3 min) and receives the pre-assigned blessing.</w:t>
+        <w:t>1. Ninety seconds of silence to settle — the silence is part of the practice.</w:t>
       </w:r>
     </w:p>
     <w:p>
@@ -711,7 +711,7 @@
         <w:ind w:left="216"/>
       </w:pPr>
       <w:r>
-        <w:t>2. Parents next, arranged parent opening, within the rails; then the teens at their own depth — pass honored without a flicker. A teen blessing their own parent is one of the best things this night produces.</w:t>
+        <w:t>2. The parent goes first in every pair (3 min), own struggles only, within the rails; then the teens at their own depth — pass honored without a flicker. A teen blessing their own parent is one of the best things this night produces.</w:t>
       </w:r>
     </w:p>
     <w:p>

</xml_diff>

<commit_message>
The homework practice by name + the quarter break leaves the active walk (John's calls on the v2.12 flag): 90 title spots across 45 md records + the template rendition; S6 record/run sheet to 'the two weeks', Pulse removed from S6 deck notes + leader notes commissioning/closing beats, S7 door cue now the 7:25 three-questions block; arc labels kept; S11/S16/S17 quarter-shaped homework held for John's design word; changelog v2.13
Co-Authored-By: Claude Fable 5 <noreply@anthropic.com>
</commit_message>
<xml_diff>
--- a/_implementation-notes/evening-series/FotH Evening Session 6 Leader Notes DRAFT v1.docx
+++ b/_implementation-notes/evening-series/FotH Evening Session 6 Leader Notes DRAFT v1.docx
@@ -237,7 +237,7 @@
         <w:ind w:left="216"/>
       </w:pPr>
       <w:r>
-        <w:t>2. Shape: open, check-in, 13-minute teaching, YOUR demo, bridge, 33-minute pair practice (Companion, then parents, then teens), merge and shared blessing, Examen plus Quarterly Pulse, feedback, close. Quarter 1 ends today.</w:t>
+        <w:t>2. Shape: open, check-in, 13-minute teaching, YOUR demo, bridge, 33-minute pair practice (Companion, then parents, then teens), merge and shared blessing, Examen plus the three questions carried home, feedback, close. Quarter 1 ends today.</w:t>
       </w:r>
     </w:p>
     <w:p>
@@ -879,7 +879,7 @@
         <w:ind w:left="216"/>
       </w:pPr>
       <w:r>
-        <w:t>3. (Current-condition walk: no quarter break and no paper Pulse — the three reflection questions ride home as a thinking point, next slide but two.)</w:t>
+        <w:t>3. The three reflection questions ride home as a thinking point — next slide but two.</w:t>
       </w:r>
     </w:p>
     <w:p>
@@ -1218,7 +1218,7 @@
         <w:ind w:left="216"/>
       </w:pPr>
       <w:r>
-        <w:t>3. Aaronic blessing. 'Go gently. Today closes the quarter — carry the Examen through the break; bring the Pulse back to the Week 7 door.'</w:t>
+        <w:t>3. Aaronic blessing. 'Go gently. Today closes the quarter — carry the Examen through the two weeks, and bring the three questions with you; next evening, we talk.'</w:t>
       </w:r>
     </w:p>
     <w:p>

</xml_diff>